<commit_message>
Replace AI pitch feedback with a Peer Pitch Board across TV and Movies
- Removed all AI features (TV AI Pitch Review, TV AI pitch ideas, Movies AI
  feedback), utils/ai_grading.py, its tests, and the anthropic dependency.
  No API key is needed anywhere.
- Peer Pitch Board: a TV show greenlit from a team's own pitch, and every
  film a team simulates (logline + NPV + critics score), is posted for the
  team's own school + class section. Re-posting the same pitch key replaces
  it (Redo / re-simulate). Stored via utils/storage (append-only INSERT on
  the database backend; lock + atomic write on files).
- Shown in full on the Leaderboard page and in a collapsed "See what other
  teams in your class have pitched" box beside each pitch form.
- Student guides and the instructor board reference updated (Board 2 now
  uses the Pitch Board in the debrief); README deployment note rewritten.

Co-Authored-By: Claude Opus 5.5 <noreply@anthropic.com>
</commit_message>
<xml_diff>
--- a/docs/The_Slate_Instructor_Plan_Movies_Week_85min.docx
+++ b/docs/The_Slate_Instructor_Plan_Movies_Week_85min.docx
@@ -2218,6 +2218,29 @@
     </w:p>
     <w:p>
       <w:pPr>
+        <w:pStyle w:val="ListBullet"/>
+      </w:pPr>
+      <w:r>
+        <w:rPr>
+          <w:b w:val="0"/>
+        </w:rPr>
+        <w:t xml:space="preserve">Open the </w:t>
+      </w:r>
+      <w:r>
+        <w:rPr>
+          <w:b/>
+        </w:rPr>
+        <w:t>📋 Pitch Board</w:t>
+      </w:r>
+      <w:r>
+        <w:rPr>
+          <w:b w:val="0"/>
+        </w:rPr>
+        <w:t xml:space="preserve"> (Leaderboard page): read a top team's logline and a bottom team's aloud, with each film's actual result beside it. Ask: "Could you have predicted these from the pitch alone?"</w:t>
+      </w:r>
+    </w:p>
+    <w:p>
+      <w:pPr>
         <w:pStyle w:val="Heading1"/>
       </w:pPr>
       <w:r>

</xml_diff>

<commit_message>
Movies: passing depends on decisions alone, so a team that changes nothing always fails
Per user: 'a team that changes nothing should always fail as you need to try.'
Under the old rule (graded NPV incl. 25% luck), 980 of 1,000 default slates
passed on luck; now 1,000/1,000 fail while a simple genuine attempt passes
200/200. Luck still moves the score. Results screen shows PASS/FAIL (decisions
only) beside the graded NPV; app copy, README, guides, and plan updated.

Co-Authored-By: Claude Opus 5.5 <noreply@anthropic.com>
</commit_message>
<xml_diff>
--- a/docs/The_Slate_Instructor_Plan_Movies_Week_85min.docx
+++ b/docs/The_Slate_Instructor_Plan_Movies_Week_85min.docx
@@ -247,7 +247,7 @@
                 <w:b w:val="0"/>
                 <w:sz w:val="20"/>
               </w:rPr>
-              <w:t>First submitted score is official. Pass = average graded NPV above $0. Graded NPV = 75% decisions (risk-adjusted) + 25% luck (what each film actually earned).</w:t>
+              <w:t>First submitted score is official. Pass = decisions-only (risk-adjusted) NPV averages above $0, so luck can't pass a slate. The score uses graded NPV = 75% decisions + 25% luck (what each film actually earned).</w:t>
             </w:r>
           </w:p>
         </w:tc>
@@ -3931,7 +3931,7 @@
                 <w:b w:val="0"/>
                 <w:sz w:val="20"/>
               </w:rPr>
-              <w:t>Scores in the high 30s and passes or fails on luck. A good contrast for Board 2.</w:t>
+              <w:t>Always fails (score in the high 30s): passing depends on decisions alone. A good contrast for Board 2.</w:t>
             </w:r>
           </w:p>
         </w:tc>

</xml_diff>

<commit_message>
Movies: deals count in the score; Universal Studios attraction decision after a hit; docs, README and design notes brought current
- Deal ledger: partnership and renewal fees, holds, multi-picture deals,
  festival films won and attractions are credited to that cycle's film;
  compute_movie_score takes decision / actual deal adjustments (decision
  values feed the pass line and the 75% part, actual values the 25% luck
  part). Your Slate shows Film NPV and Deals; Why lines list each deal
- Attraction offer after a film earns theme-park revenue: one-time Build
  / Pass, cost ~35% of domestic box office ($40-150M), roughly break-even
  EV (better for franchises and reviews), outcome revealed on Build, +30%
  if a later Sequel in that genre keeps the franchise alive; required step
- README Movies section and 2026-10-05 changes, DESIGN_NOTES entry,
  student guides and instructor plan rebuilt; Mission Brief notes deals

Co-Authored-By: Claude Opus 5.5 <noreply@anthropic.com>
</commit_message>
<xml_diff>
--- a/docs/The_Slate_Instructor_Plan_Movies_Week_85min.docx
+++ b/docs/The_Slate_Instructor_Plan_Movies_Week_85min.docx
@@ -3880,6 +3880,156 @@
                 <w:b/>
                 <w:sz w:val="20"/>
               </w:rPr>
+              <w:t>Pay-2 window</w:t>
+            </w:r>
+          </w:p>
+        </w:tc>
+        <w:tc>
+          <w:tcPr>
+            <w:tcW w:type="dxa" w:w="6912"/>
+          </w:tcPr>
+          <w:p>
+            <w:r>
+              <w:rPr>
+                <w:b w:val="0"/>
+                <w:sz w:val="20"/>
+              </w:rPr>
+              <w:t>Decided the cycle after release and locked: 🎲 Keep (catalog gamble, better with good reviews) vs a streamer's sure fee.</w:t>
+            </w:r>
+          </w:p>
+        </w:tc>
+      </w:tr>
+      <w:tr>
+        <w:tc>
+          <w:tcPr>
+            <w:tcW w:type="dxa" w:w="2448"/>
+          </w:tcPr>
+          <w:p>
+            <w:r>
+              <w:rPr>
+                <w:b/>
+                <w:sz w:val="20"/>
+              </w:rPr>
+              <w:t>Festivals</w:t>
+            </w:r>
+          </w:p>
+        </w:tc>
+        <w:tc>
+          <w:tcPr>
+            <w:tcW w:type="dxa" w:w="6912"/>
+          </w:tcPr>
+          <w:p>
+            <w:r>
+              <w:rPr>
+                <w:b w:val="0"/>
+                <w:sz w:val="20"/>
+              </w:rPr>
+              <w:t>Bid against the analysts' break-even; hot films draw more rivals (winner's curse). Dramas are often bargains, tentpoles overpriced.</w:t>
+            </w:r>
+          </w:p>
+        </w:tc>
+      </w:tr>
+      <w:tr>
+        <w:tc>
+          <w:tcPr>
+            <w:tcW w:type="dxa" w:w="2448"/>
+          </w:tcPr>
+          <w:p>
+            <w:r>
+              <w:rPr>
+                <w:b/>
+                <w:sz w:val="20"/>
+              </w:rPr>
+              <w:t>Partnerships</w:t>
+            </w:r>
+          </w:p>
+        </w:tc>
+        <w:tc>
+          <w:tcPr>
+            <w:tcW w:type="dxa" w:w="6912"/>
+          </w:tcPr>
+          <w:p>
+            <w:r>
+              <w:rPr>
+                <w:b w:val="0"/>
+                <w:sz w:val="20"/>
+              </w:rPr>
+              <w:t>Sign once, then renew each cycle (pricier after a hit) or let go. Fees count in the score.</w:t>
+            </w:r>
+          </w:p>
+        </w:tc>
+      </w:tr>
+      <w:tr>
+        <w:tc>
+          <w:tcPr>
+            <w:tcW w:type="dxa" w:w="2448"/>
+          </w:tcPr>
+          <w:p>
+            <w:r>
+              <w:rPr>
+                <w:b/>
+                <w:sz w:val="20"/>
+              </w:rPr>
+              <w:t>Library IP / Lead Actor</w:t>
+            </w:r>
+          </w:p>
+        </w:tc>
+        <w:tc>
+          <w:tcPr>
+            <w:tcW w:type="dxa" w:w="6912"/>
+          </w:tcPr>
+          <w:p>
+            <w:r>
+              <w:rPr>
+                <w:b w:val="0"/>
+                <w:sz w:val="20"/>
+              </w:rPr>
+              <w:t>Reviving a Universal title lifts the opening (once per slate, legacy fee). A held actor's bonus applies only when cast.</w:t>
+            </w:r>
+          </w:p>
+        </w:tc>
+      </w:tr>
+      <w:tr>
+        <w:tc>
+          <w:tcPr>
+            <w:tcW w:type="dxa" w:w="2448"/>
+          </w:tcPr>
+          <w:p>
+            <w:r>
+              <w:rPr>
+                <w:b/>
+                <w:sz w:val="20"/>
+              </w:rPr>
+              <w:t>Attractions</w:t>
+            </w:r>
+          </w:p>
+        </w:tc>
+        <w:tc>
+          <w:tcPr>
+            <w:tcW w:type="dxa" w:w="6912"/>
+          </w:tcPr>
+          <w:p>
+            <w:r>
+              <w:rPr>
+                <w:b w:val="0"/>
+                <w:sz w:val="20"/>
+              </w:rPr>
+              <w:t>After a park-genre hit: Build / Pass a Universal Studios attraction. Roughly break-even on average; better for sequels and family films.</w:t>
+            </w:r>
+          </w:p>
+        </w:tc>
+      </w:tr>
+      <w:tr>
+        <w:tc>
+          <w:tcPr>
+            <w:tcW w:type="dxa" w:w="2448"/>
+          </w:tcPr>
+          <w:p>
+            <w:r>
+              <w:rPr>
+                <w:b/>
+                <w:sz w:val="20"/>
+              </w:rPr>
               <w:t>Scoring</w:t>
             </w:r>
           </w:p>
@@ -3894,7 +4044,7 @@
                 <w:b w:val="0"/>
                 <w:sz w:val="20"/>
               </w:rPr>
-              <w:t>Risk-adjusted NPV 45%, capital efficiency 20%, strategic fit 20%, diversification 15%. Graded NPV = 75% decisions + 25% luck.</w:t>
+              <w:t>Risk-adjusted NPV 45%, capital efficiency 20%, strategic fit 20%, diversification 15%. Graded NPV = 75% decisions + 25% luck, plus each cycle's deals (fees, festival films, attractions).</w:t>
             </w:r>
           </w:p>
         </w:tc>

</xml_diff>

<commit_message>
Movies: no pitch required to Simulate either
Per user: "for movie slate, no pitch should be required either to
simulate." _simulate_blockers returns nothing; the Greenlight button and
step check no longer need a logline; Simulate stays open on a blank cycle.
A film simulated without a pitch shows "(no pitch written)" on the Pitch
Board. Student guide, instructor plan and README updated; tests rewritten
for the new rule. 553 pass.

Co-Authored-By: Claude Opus 5.5 <noreply@anthropic.com>
</commit_message>
<xml_diff>
--- a/docs/The_Slate_Instructor_Plan_Movies_Week_85min.docx
+++ b/docs/The_Slate_Instructor_Plan_Movies_Week_85min.docx
@@ -315,13 +315,13 @@
         <w:rPr>
           <w:b/>
         </w:rPr>
-        <w:t>draft five loglines</w:t>
+        <w:t>draft four loglines</w:t>
       </w:r>
       <w:r>
         <w:rPr>
           <w:b w:val="0"/>
         </w:rPr>
-        <w:t>, one per film. Simulate stays locked without one; drafting in class eats play time.</w:t>
+        <w:t>, one per film. Pitches are optional, but they're what the class sees on the Pitch Board; drafting in class eats play time.</w:t>
       </w:r>
     </w:p>
     <w:p>

</xml_diff>